<commit_message>
This keyword in js
</commit_message>
<xml_diff>
--- a/Javascript interviev question.docx
+++ b/Javascript interviev question.docx
@@ -358,397 +358,643 @@
     </w:p>
     <w:p>
       <w:pPr>
-        <w:spacing w:before="100" w:beforeAutospacing="1" w:after="100" w:afterAutospacing="1" w:line="240" w:lineRule="auto"/>
-        <w:rPr>
-          <w:rFonts w:ascii="Times New Roman" w:eastAsia="Times New Roman" w:hAnsi="Times New Roman" w:cs="Times New Roman"/>
-          <w:sz w:val="24"/>
-          <w:szCs w:val="24"/>
-        </w:rPr>
-      </w:pPr>
+        <w:pStyle w:val="NoSpacing"/>
+        <w:ind w:left="360" w:hanging="360"/>
+        <w:rPr>
+          <w:rFonts w:ascii="Arial" w:hAnsi="Arial" w:cs="Arial"/>
+          <w:b/>
+          <w:color w:val="E36C0A" w:themeColor="accent6" w:themeShade="BF"/>
+          <w:sz w:val="24"/>
+          <w:szCs w:val="24"/>
+        </w:rPr>
+      </w:pPr>
+    </w:p>
+    <w:p>
+      <w:pPr>
+        <w:pStyle w:val="NoSpacing"/>
+        <w:ind w:left="360" w:hanging="360"/>
+        <w:rPr>
+          <w:rFonts w:ascii="Arial" w:hAnsi="Arial" w:cs="Arial"/>
+          <w:b/>
+          <w:color w:val="E36C0A" w:themeColor="accent6" w:themeShade="BF"/>
+          <w:sz w:val="24"/>
+          <w:szCs w:val="24"/>
+        </w:rPr>
+      </w:pPr>
+      <w:r>
+        <w:rPr>
+          <w:rFonts w:ascii="Arial" w:hAnsi="Arial" w:cs="Arial"/>
+          <w:b/>
+          <w:color w:val="E36C0A" w:themeColor="accent6" w:themeShade="BF"/>
+          <w:sz w:val="24"/>
+          <w:szCs w:val="24"/>
+        </w:rPr>
+        <w:t xml:space="preserve">9. </w:t>
+      </w:r>
+      <w:r>
+        <w:rPr>
+          <w:rFonts w:ascii="Arial" w:hAnsi="Arial" w:cs="Arial"/>
+          <w:b/>
+          <w:color w:val="E36C0A" w:themeColor="accent6" w:themeShade="BF"/>
+          <w:sz w:val="24"/>
+          <w:szCs w:val="24"/>
+        </w:rPr>
+        <w:tab/>
+      </w:r>
+      <w:r>
+        <w:rPr>
+          <w:rFonts w:ascii="Arial" w:hAnsi="Arial" w:cs="Arial"/>
+          <w:b/>
+          <w:color w:val="E36C0A" w:themeColor="accent6" w:themeShade="BF"/>
+          <w:sz w:val="24"/>
+          <w:szCs w:val="24"/>
+        </w:rPr>
+        <w:t xml:space="preserve">What does the "this" keyword indicate in JavaScript? </w:t>
+      </w:r>
+    </w:p>
+    <w:p>
+      <w:pPr>
+        <w:pStyle w:val="NoSpacing"/>
+        <w:ind w:left="360" w:hanging="360"/>
+        <w:jc w:val="both"/>
+        <w:rPr>
+          <w:rFonts w:ascii="Arial" w:hAnsi="Arial" w:cs="Arial"/>
+          <w:sz w:val="24"/>
+          <w:szCs w:val="24"/>
+        </w:rPr>
+      </w:pPr>
+      <w:r>
+        <w:rPr>
+          <w:rFonts w:ascii="Arial" w:hAnsi="Arial" w:cs="Arial"/>
+          <w:sz w:val="24"/>
+          <w:szCs w:val="24"/>
+        </w:rPr>
+        <w:tab/>
+      </w:r>
+      <w:proofErr w:type="gramStart"/>
+      <w:r>
+        <w:rPr>
+          <w:rFonts w:ascii="Arial" w:hAnsi="Arial" w:cs="Arial"/>
+          <w:b/>
+          <w:sz w:val="24"/>
+          <w:szCs w:val="24"/>
+        </w:rPr>
+        <w:t>this</w:t>
+      </w:r>
+      <w:proofErr w:type="gramEnd"/>
+      <w:r>
+        <w:rPr>
+          <w:rFonts w:ascii="Arial" w:hAnsi="Arial" w:cs="Arial"/>
+          <w:sz w:val="24"/>
+          <w:szCs w:val="24"/>
+        </w:rPr>
+        <w:t xml:space="preserve"> refers to the object that is currently executing the code. Its value depends on how a function is called:</w:t>
+      </w:r>
+    </w:p>
+    <w:p>
+      <w:pPr>
+        <w:pStyle w:val="NoSpacing"/>
+        <w:tabs>
+          <w:tab w:val="left" w:pos="360"/>
+        </w:tabs>
+        <w:ind w:left="540" w:hanging="540"/>
+        <w:jc w:val="both"/>
+        <w:rPr>
+          <w:rFonts w:ascii="Arial" w:hAnsi="Arial" w:cs="Arial"/>
+          <w:sz w:val="24"/>
+          <w:szCs w:val="24"/>
+        </w:rPr>
+      </w:pPr>
+      <w:r>
+        <w:rPr>
+          <w:rFonts w:ascii="Arial" w:hAnsi="Arial" w:cs="Arial"/>
+          <w:sz w:val="24"/>
+          <w:szCs w:val="24"/>
+        </w:rPr>
+        <w:tab/>
+      </w:r>
+      <w:r>
+        <w:rPr>
+          <w:rFonts w:ascii="Arial" w:hAnsi="Arial" w:cs="Arial"/>
+          <w:sz w:val="24"/>
+          <w:szCs w:val="24"/>
+        </w:rPr>
+        <w:t>-</w:t>
+      </w:r>
+      <w:r>
+        <w:rPr>
+          <w:rFonts w:ascii="Arial" w:hAnsi="Arial" w:cs="Arial"/>
+          <w:sz w:val="24"/>
+          <w:szCs w:val="24"/>
+        </w:rPr>
+        <w:tab/>
+        <w:t xml:space="preserve">In Global scope this refers to </w:t>
+      </w:r>
+      <w:r>
+        <w:rPr>
+          <w:rFonts w:ascii="Arial" w:hAnsi="Arial" w:cs="Arial"/>
+          <w:sz w:val="24"/>
+          <w:szCs w:val="24"/>
+        </w:rPr>
+        <w:t>the global object (window in browsers; undefined in strict mode functions).</w:t>
+      </w:r>
+    </w:p>
+    <w:p>
+      <w:pPr>
+        <w:pStyle w:val="NoSpacing"/>
+        <w:tabs>
+          <w:tab w:val="left" w:pos="360"/>
+        </w:tabs>
+        <w:ind w:left="540" w:hanging="540"/>
+        <w:jc w:val="both"/>
+        <w:rPr>
+          <w:rFonts w:ascii="Arial" w:hAnsi="Arial" w:cs="Arial"/>
+          <w:sz w:val="24"/>
+          <w:szCs w:val="24"/>
+        </w:rPr>
+      </w:pPr>
+      <w:r>
+        <w:rPr>
+          <w:rFonts w:ascii="Arial" w:hAnsi="Arial" w:cs="Arial"/>
+          <w:sz w:val="24"/>
+          <w:szCs w:val="24"/>
+        </w:rPr>
+        <w:tab/>
+      </w:r>
+      <w:r>
+        <w:rPr>
+          <w:rFonts w:ascii="Arial" w:hAnsi="Arial" w:cs="Arial"/>
+          <w:sz w:val="24"/>
+          <w:szCs w:val="24"/>
+        </w:rPr>
+        <w:t xml:space="preserve">- </w:t>
+      </w:r>
+      <w:r>
+        <w:rPr>
+          <w:rFonts w:ascii="Arial" w:hAnsi="Arial" w:cs="Arial"/>
+          <w:sz w:val="24"/>
+          <w:szCs w:val="24"/>
+        </w:rPr>
+        <w:tab/>
+        <w:t xml:space="preserve">In Object method </w:t>
+      </w:r>
+      <w:r>
+        <w:rPr>
+          <w:rFonts w:ascii="Arial" w:hAnsi="Arial" w:cs="Arial"/>
+          <w:sz w:val="24"/>
+          <w:szCs w:val="24"/>
+        </w:rPr>
+        <w:t>this refers to</w:t>
+      </w:r>
+      <w:r>
+        <w:rPr>
+          <w:rFonts w:ascii="Arial" w:hAnsi="Arial" w:cs="Arial"/>
+          <w:sz w:val="24"/>
+          <w:szCs w:val="24"/>
+        </w:rPr>
+        <w:t xml:space="preserve"> the object before the dot (</w:t>
+      </w:r>
+      <w:proofErr w:type="spellStart"/>
+      <w:proofErr w:type="gramStart"/>
+      <w:r>
+        <w:rPr>
+          <w:rFonts w:ascii="Arial" w:hAnsi="Arial" w:cs="Arial"/>
+          <w:sz w:val="24"/>
+          <w:szCs w:val="24"/>
+        </w:rPr>
+        <w:t>obj.method</w:t>
+      </w:r>
+      <w:proofErr w:type="spellEnd"/>
+      <w:r>
+        <w:rPr>
+          <w:rFonts w:ascii="Arial" w:hAnsi="Arial" w:cs="Arial"/>
+          <w:sz w:val="24"/>
+          <w:szCs w:val="24"/>
+        </w:rPr>
+        <w:t>(</w:t>
+      </w:r>
+      <w:proofErr w:type="gramEnd"/>
+      <w:r>
+        <w:rPr>
+          <w:rFonts w:ascii="Arial" w:hAnsi="Arial" w:cs="Arial"/>
+          <w:sz w:val="24"/>
+          <w:szCs w:val="24"/>
+        </w:rPr>
+        <w:t xml:space="preserve">) gives </w:t>
+      </w:r>
+      <w:proofErr w:type="spellStart"/>
+      <w:r>
+        <w:rPr>
+          <w:rFonts w:ascii="Arial" w:hAnsi="Arial" w:cs="Arial"/>
+          <w:sz w:val="24"/>
+          <w:szCs w:val="24"/>
+        </w:rPr>
+        <w:t>obj</w:t>
+      </w:r>
+      <w:proofErr w:type="spellEnd"/>
+      <w:r>
+        <w:rPr>
+          <w:rFonts w:ascii="Arial" w:hAnsi="Arial" w:cs="Arial"/>
+          <w:sz w:val="24"/>
+          <w:szCs w:val="24"/>
+        </w:rPr>
+        <w:t>).</w:t>
+      </w:r>
+    </w:p>
+    <w:p>
+      <w:pPr>
+        <w:pStyle w:val="NoSpacing"/>
+        <w:tabs>
+          <w:tab w:val="left" w:pos="360"/>
+        </w:tabs>
+        <w:ind w:left="540" w:hanging="540"/>
+        <w:jc w:val="both"/>
+        <w:rPr>
+          <w:rFonts w:ascii="Arial" w:hAnsi="Arial" w:cs="Arial"/>
+          <w:sz w:val="24"/>
+          <w:szCs w:val="24"/>
+        </w:rPr>
+      </w:pPr>
+      <w:r>
+        <w:rPr>
+          <w:rFonts w:ascii="Arial" w:hAnsi="Arial" w:cs="Arial"/>
+          <w:sz w:val="24"/>
+          <w:szCs w:val="24"/>
+        </w:rPr>
+        <w:tab/>
+      </w:r>
+      <w:r>
+        <w:rPr>
+          <w:rFonts w:ascii="Arial" w:hAnsi="Arial" w:cs="Arial"/>
+          <w:sz w:val="24"/>
+          <w:szCs w:val="24"/>
+        </w:rPr>
+        <w:t xml:space="preserve">- </w:t>
+      </w:r>
+      <w:r>
+        <w:rPr>
+          <w:rFonts w:ascii="Arial" w:hAnsi="Arial" w:cs="Arial"/>
+          <w:sz w:val="24"/>
+          <w:szCs w:val="24"/>
+        </w:rPr>
+        <w:tab/>
+        <w:t>In Constructor / class (new)</w:t>
+      </w:r>
+      <w:r>
+        <w:rPr>
+          <w:rFonts w:ascii="Arial" w:hAnsi="Arial" w:cs="Arial"/>
+          <w:sz w:val="24"/>
+          <w:szCs w:val="24"/>
+        </w:rPr>
+        <w:t xml:space="preserve"> </w:t>
+      </w:r>
+      <w:r>
+        <w:rPr>
+          <w:rFonts w:ascii="Arial" w:hAnsi="Arial" w:cs="Arial"/>
+          <w:sz w:val="24"/>
+          <w:szCs w:val="24"/>
+        </w:rPr>
+        <w:t>this refers to</w:t>
+      </w:r>
+      <w:r>
+        <w:rPr>
+          <w:rFonts w:ascii="Arial" w:hAnsi="Arial" w:cs="Arial"/>
+          <w:sz w:val="24"/>
+          <w:szCs w:val="24"/>
+        </w:rPr>
+        <w:t xml:space="preserve"> </w:t>
+      </w:r>
+      <w:r>
+        <w:rPr>
+          <w:rFonts w:ascii="Arial" w:hAnsi="Arial" w:cs="Arial"/>
+          <w:sz w:val="24"/>
+          <w:szCs w:val="24"/>
+        </w:rPr>
+        <w:t>the newly created object.</w:t>
+      </w:r>
+    </w:p>
+    <w:p>
+      <w:pPr>
+        <w:pStyle w:val="NoSpacing"/>
+        <w:tabs>
+          <w:tab w:val="left" w:pos="360"/>
+        </w:tabs>
+        <w:ind w:left="540" w:hanging="540"/>
+        <w:jc w:val="both"/>
+        <w:rPr>
+          <w:rFonts w:ascii="Arial" w:hAnsi="Arial" w:cs="Arial"/>
+          <w:sz w:val="24"/>
+          <w:szCs w:val="24"/>
+        </w:rPr>
+      </w:pPr>
+      <w:r>
+        <w:rPr>
+          <w:rFonts w:ascii="Arial" w:hAnsi="Arial" w:cs="Arial"/>
+          <w:sz w:val="24"/>
+          <w:szCs w:val="24"/>
+        </w:rPr>
+        <w:tab/>
+      </w:r>
+      <w:r>
+        <w:rPr>
+          <w:rFonts w:ascii="Arial" w:hAnsi="Arial" w:cs="Arial"/>
+          <w:sz w:val="24"/>
+          <w:szCs w:val="24"/>
+        </w:rPr>
+        <w:t xml:space="preserve">- </w:t>
+      </w:r>
+      <w:r>
+        <w:rPr>
+          <w:rFonts w:ascii="Arial" w:hAnsi="Arial" w:cs="Arial"/>
+          <w:sz w:val="24"/>
+          <w:szCs w:val="24"/>
+        </w:rPr>
+        <w:tab/>
+        <w:t>call / apply / bind</w:t>
+      </w:r>
+      <w:r>
+        <w:rPr>
+          <w:rFonts w:ascii="Arial" w:hAnsi="Arial" w:cs="Arial"/>
+          <w:sz w:val="24"/>
+          <w:szCs w:val="24"/>
+        </w:rPr>
+        <w:t xml:space="preserve"> whatever object you specify.</w:t>
+      </w:r>
+    </w:p>
+    <w:p>
+      <w:pPr>
+        <w:pStyle w:val="NoSpacing"/>
+        <w:tabs>
+          <w:tab w:val="left" w:pos="360"/>
+        </w:tabs>
+        <w:ind w:left="540" w:hanging="540"/>
+        <w:jc w:val="both"/>
+        <w:rPr>
+          <w:rFonts w:ascii="Arial" w:hAnsi="Arial" w:cs="Arial"/>
+          <w:sz w:val="24"/>
+          <w:szCs w:val="24"/>
+        </w:rPr>
+      </w:pPr>
+      <w:r>
+        <w:rPr>
+          <w:rFonts w:ascii="Arial" w:hAnsi="Arial" w:cs="Arial"/>
+          <w:sz w:val="24"/>
+          <w:szCs w:val="24"/>
+        </w:rPr>
+        <w:tab/>
+      </w:r>
+      <w:r>
+        <w:rPr>
+          <w:rFonts w:ascii="Arial" w:hAnsi="Arial" w:cs="Arial"/>
+          <w:sz w:val="24"/>
+          <w:szCs w:val="24"/>
+        </w:rPr>
+        <w:t xml:space="preserve">- </w:t>
+      </w:r>
+      <w:r>
+        <w:rPr>
+          <w:rFonts w:ascii="Arial" w:hAnsi="Arial" w:cs="Arial"/>
+          <w:sz w:val="24"/>
+          <w:szCs w:val="24"/>
+        </w:rPr>
+        <w:tab/>
+        <w:t>In Arrow functions there</w:t>
+      </w:r>
+      <w:r>
+        <w:rPr>
+          <w:rFonts w:ascii="Arial" w:hAnsi="Arial" w:cs="Arial"/>
+          <w:sz w:val="24"/>
+          <w:szCs w:val="24"/>
+        </w:rPr>
+        <w:t xml:space="preserve"> have no own this; they inherit it from the surrounding scope.</w:t>
+      </w:r>
+    </w:p>
+    <w:p>
+      <w:pPr>
+        <w:pStyle w:val="NoSpacing"/>
+        <w:tabs>
+          <w:tab w:val="left" w:pos="360"/>
+        </w:tabs>
+        <w:ind w:left="540" w:hanging="540"/>
+        <w:jc w:val="both"/>
+        <w:rPr>
+          <w:rFonts w:ascii="Arial" w:hAnsi="Arial" w:cs="Arial"/>
+          <w:sz w:val="24"/>
+          <w:szCs w:val="24"/>
+        </w:rPr>
+      </w:pPr>
+      <w:r>
+        <w:rPr>
+          <w:rFonts w:ascii="Arial" w:hAnsi="Arial" w:cs="Arial"/>
+          <w:sz w:val="24"/>
+          <w:szCs w:val="24"/>
+        </w:rPr>
+        <w:tab/>
+      </w:r>
+      <w:r>
+        <w:rPr>
+          <w:rFonts w:ascii="Arial" w:hAnsi="Arial" w:cs="Arial"/>
+          <w:sz w:val="24"/>
+          <w:szCs w:val="24"/>
+        </w:rPr>
+        <w:t xml:space="preserve">- </w:t>
+      </w:r>
+      <w:r>
+        <w:rPr>
+          <w:rFonts w:ascii="Arial" w:hAnsi="Arial" w:cs="Arial"/>
+          <w:sz w:val="24"/>
+          <w:szCs w:val="24"/>
+        </w:rPr>
+        <w:tab/>
+        <w:t xml:space="preserve">In Event handler </w:t>
+      </w:r>
+      <w:r>
+        <w:rPr>
+          <w:rFonts w:ascii="Arial" w:hAnsi="Arial" w:cs="Arial"/>
+          <w:sz w:val="24"/>
+          <w:szCs w:val="24"/>
+        </w:rPr>
+        <w:t>this refers to</w:t>
+      </w:r>
+      <w:r>
+        <w:rPr>
+          <w:rFonts w:ascii="Arial" w:hAnsi="Arial" w:cs="Arial"/>
+          <w:sz w:val="24"/>
+          <w:szCs w:val="24"/>
+        </w:rPr>
+        <w:t xml:space="preserve"> the element that received the event (regular functions). </w:t>
+      </w:r>
+    </w:p>
+    <w:p>
+      <w:pPr>
+        <w:pStyle w:val="NoSpacing"/>
+        <w:ind w:left="360" w:hanging="360"/>
+        <w:rPr>
+          <w:rFonts w:ascii="Arial" w:hAnsi="Arial" w:cs="Arial"/>
+          <w:b/>
+          <w:color w:val="E36C0A" w:themeColor="accent6" w:themeShade="BF"/>
+          <w:sz w:val="24"/>
+          <w:szCs w:val="24"/>
+        </w:rPr>
+      </w:pPr>
+    </w:p>
+    <w:p>
+      <w:pPr>
+        <w:pStyle w:val="NoSpacing"/>
+        <w:ind w:left="360" w:hanging="360"/>
+        <w:rPr>
+          <w:rFonts w:ascii="Arial" w:hAnsi="Arial" w:cs="Arial"/>
+          <w:b/>
+          <w:color w:val="E36C0A" w:themeColor="accent6" w:themeShade="BF"/>
+          <w:sz w:val="24"/>
+          <w:szCs w:val="24"/>
+        </w:rPr>
+      </w:pPr>
+      <w:r>
+        <w:rPr>
+          <w:rFonts w:ascii="Arial" w:hAnsi="Arial" w:cs="Arial"/>
+          <w:b/>
+          <w:color w:val="E36C0A" w:themeColor="accent6" w:themeShade="BF"/>
+          <w:sz w:val="24"/>
+          <w:szCs w:val="24"/>
+        </w:rPr>
+        <w:t xml:space="preserve">10. What is Event bubbling in JS? </w:t>
+      </w:r>
+    </w:p>
+    <w:p>
+      <w:pPr>
+        <w:pStyle w:val="NoSpacing"/>
+        <w:ind w:left="360" w:hanging="360"/>
+        <w:jc w:val="both"/>
+        <w:rPr>
+          <w:rFonts w:ascii="Arial" w:hAnsi="Arial" w:cs="Arial"/>
+          <w:sz w:val="24"/>
+          <w:szCs w:val="24"/>
+        </w:rPr>
+      </w:pPr>
+      <w:r>
+        <w:tab/>
+      </w:r>
+      <w:r>
+        <w:rPr>
+          <w:rFonts w:ascii="Arial" w:hAnsi="Arial" w:cs="Arial"/>
+          <w:sz w:val="24"/>
+          <w:szCs w:val="24"/>
+        </w:rPr>
+        <w:t xml:space="preserve">When an event occurs on an element, it first runs the handlers on that element, </w:t>
+      </w:r>
+      <w:proofErr w:type="gramStart"/>
+      <w:r>
+        <w:rPr>
+          <w:rFonts w:ascii="Arial" w:hAnsi="Arial" w:cs="Arial"/>
+          <w:sz w:val="24"/>
+          <w:szCs w:val="24"/>
+        </w:rPr>
+        <w:t>then</w:t>
+      </w:r>
+      <w:proofErr w:type="gramEnd"/>
+      <w:r>
+        <w:rPr>
+          <w:rFonts w:ascii="Arial" w:hAnsi="Arial" w:cs="Arial"/>
+          <w:sz w:val="24"/>
+          <w:szCs w:val="24"/>
+        </w:rPr>
+        <w:t xml:space="preserve"> bubbles up to its parent, then the grandparent, all the way to the document. Events travel in three phases: </w:t>
+      </w:r>
+    </w:p>
+    <w:p>
+      <w:pPr>
+        <w:pStyle w:val="NoSpacing"/>
+        <w:ind w:left="360" w:hanging="360"/>
+        <w:jc w:val="both"/>
+        <w:rPr>
+          <w:rFonts w:ascii="Arial" w:hAnsi="Arial" w:cs="Arial"/>
+          <w:sz w:val="24"/>
+          <w:szCs w:val="24"/>
+        </w:rPr>
+      </w:pPr>
+      <w:r>
+        <w:rPr>
+          <w:rFonts w:ascii="Arial" w:hAnsi="Arial" w:cs="Arial"/>
+          <w:sz w:val="24"/>
+          <w:szCs w:val="24"/>
+        </w:rPr>
+        <w:tab/>
+        <w:t xml:space="preserve">- </w:t>
+      </w:r>
+      <w:r>
+        <w:rPr>
+          <w:rFonts w:ascii="Arial" w:hAnsi="Arial" w:cs="Arial"/>
+          <w:sz w:val="24"/>
+          <w:szCs w:val="24"/>
+        </w:rPr>
+        <w:t xml:space="preserve">capturing (top to target), </w:t>
+      </w:r>
+    </w:p>
+    <w:p>
+      <w:pPr>
+        <w:pStyle w:val="NoSpacing"/>
+        <w:ind w:left="360" w:hanging="360"/>
+        <w:jc w:val="both"/>
+        <w:rPr>
+          <w:rFonts w:ascii="Arial" w:hAnsi="Arial" w:cs="Arial"/>
+          <w:sz w:val="24"/>
+          <w:szCs w:val="24"/>
+        </w:rPr>
+      </w:pPr>
+      <w:r>
+        <w:rPr>
+          <w:rFonts w:ascii="Arial" w:hAnsi="Arial" w:cs="Arial"/>
+          <w:sz w:val="24"/>
+          <w:szCs w:val="24"/>
+        </w:rPr>
+        <w:tab/>
+        <w:t xml:space="preserve">- </w:t>
+      </w:r>
+      <w:proofErr w:type="gramStart"/>
+      <w:r>
+        <w:rPr>
+          <w:rFonts w:ascii="Arial" w:hAnsi="Arial" w:cs="Arial"/>
+          <w:sz w:val="24"/>
+          <w:szCs w:val="24"/>
+        </w:rPr>
+        <w:t>target</w:t>
+      </w:r>
+      <w:proofErr w:type="gramEnd"/>
+      <w:r>
+        <w:rPr>
+          <w:rFonts w:ascii="Arial" w:hAnsi="Arial" w:cs="Arial"/>
+          <w:sz w:val="24"/>
+          <w:szCs w:val="24"/>
+        </w:rPr>
+        <w:t xml:space="preserve">, and </w:t>
+      </w:r>
+    </w:p>
+    <w:p>
+      <w:pPr>
+        <w:pStyle w:val="NoSpacing"/>
+        <w:ind w:left="360" w:hanging="360"/>
+        <w:jc w:val="both"/>
+      </w:pPr>
+      <w:r>
+        <w:rPr>
+          <w:rFonts w:ascii="Arial" w:hAnsi="Arial" w:cs="Arial"/>
+          <w:sz w:val="24"/>
+          <w:szCs w:val="24"/>
+        </w:rPr>
+        <w:tab/>
+        <w:t xml:space="preserve">- </w:t>
+      </w:r>
+      <w:r>
+        <w:rPr>
+          <w:rFonts w:ascii="Arial" w:hAnsi="Arial" w:cs="Arial"/>
+          <w:sz w:val="24"/>
+          <w:szCs w:val="24"/>
+        </w:rPr>
+        <w:t>bubbling (target to top).</w:t>
+      </w:r>
       <w:bookmarkStart w:id="0" w:name="_GoBack"/>
       <w:bookmarkEnd w:id="0"/>
-    </w:p>
-    <w:p>
-      <w:pPr>
-        <w:pStyle w:val="NoSpacing"/>
-        <w:ind w:left="360" w:hanging="360"/>
-        <w:rPr>
-          <w:rFonts w:ascii="Arial" w:hAnsi="Arial" w:cs="Arial"/>
-          <w:b/>
-          <w:color w:val="E36C0A" w:themeColor="accent6" w:themeShade="BF"/>
-          <w:sz w:val="24"/>
-          <w:szCs w:val="24"/>
-        </w:rPr>
-      </w:pPr>
-      <w:r>
-        <w:rPr>
-          <w:rFonts w:ascii="Arial" w:hAnsi="Arial" w:cs="Arial"/>
-          <w:b/>
-          <w:color w:val="E36C0A" w:themeColor="accent6" w:themeShade="BF"/>
-          <w:sz w:val="24"/>
-          <w:szCs w:val="24"/>
-        </w:rPr>
-        <w:t xml:space="preserve">9. </w:t>
-      </w:r>
-      <w:r>
-        <w:rPr>
-          <w:rFonts w:ascii="Arial" w:hAnsi="Arial" w:cs="Arial"/>
-          <w:b/>
-          <w:color w:val="E36C0A" w:themeColor="accent6" w:themeShade="BF"/>
-          <w:sz w:val="24"/>
-          <w:szCs w:val="24"/>
-        </w:rPr>
-        <w:tab/>
-      </w:r>
-      <w:r>
-        <w:rPr>
-          <w:rFonts w:ascii="Arial" w:hAnsi="Arial" w:cs="Arial"/>
-          <w:b/>
-          <w:color w:val="E36C0A" w:themeColor="accent6" w:themeShade="BF"/>
-          <w:sz w:val="24"/>
-          <w:szCs w:val="24"/>
-        </w:rPr>
-        <w:t xml:space="preserve">What does the "this" keyword indicate in JavaScript? </w:t>
-      </w:r>
-    </w:p>
-    <w:p>
-      <w:pPr>
-        <w:pStyle w:val="NoSpacing"/>
-        <w:ind w:left="360" w:hanging="360"/>
-        <w:jc w:val="both"/>
-        <w:rPr>
-          <w:rFonts w:ascii="Arial" w:hAnsi="Arial" w:cs="Arial"/>
-          <w:sz w:val="24"/>
-          <w:szCs w:val="24"/>
-        </w:rPr>
-      </w:pPr>
-      <w:r>
-        <w:rPr>
-          <w:rFonts w:ascii="Arial" w:hAnsi="Arial" w:cs="Arial"/>
-          <w:sz w:val="24"/>
-          <w:szCs w:val="24"/>
-        </w:rPr>
-        <w:tab/>
-      </w:r>
-      <w:proofErr w:type="gramStart"/>
-      <w:r>
-        <w:rPr>
-          <w:rFonts w:ascii="Arial" w:hAnsi="Arial" w:cs="Arial"/>
-          <w:b/>
-          <w:sz w:val="24"/>
-          <w:szCs w:val="24"/>
-        </w:rPr>
-        <w:t>this</w:t>
-      </w:r>
-      <w:proofErr w:type="gramEnd"/>
-      <w:r>
-        <w:rPr>
-          <w:rFonts w:ascii="Arial" w:hAnsi="Arial" w:cs="Arial"/>
-          <w:sz w:val="24"/>
-          <w:szCs w:val="24"/>
-        </w:rPr>
-        <w:t xml:space="preserve"> refers to the object that is currently executing the code. Its value depends on how a function is called:</w:t>
-      </w:r>
-    </w:p>
-    <w:p>
-      <w:pPr>
-        <w:pStyle w:val="NoSpacing"/>
-        <w:ind w:left="360" w:hanging="360"/>
-        <w:jc w:val="both"/>
-        <w:rPr>
-          <w:rFonts w:ascii="Arial" w:hAnsi="Arial" w:cs="Arial"/>
-          <w:sz w:val="24"/>
-          <w:szCs w:val="24"/>
-        </w:rPr>
-      </w:pPr>
-      <w:r>
-        <w:rPr>
-          <w:rFonts w:ascii="Arial" w:hAnsi="Arial" w:cs="Arial"/>
-          <w:sz w:val="24"/>
-          <w:szCs w:val="24"/>
-        </w:rPr>
-        <w:tab/>
-      </w:r>
-      <w:r>
-        <w:rPr>
-          <w:rFonts w:ascii="Arial" w:hAnsi="Arial" w:cs="Arial"/>
-          <w:b/>
-          <w:sz w:val="24"/>
-          <w:szCs w:val="24"/>
-        </w:rPr>
-        <w:t>- Global scope:</w:t>
-      </w:r>
-      <w:r>
-        <w:rPr>
-          <w:rFonts w:ascii="Arial" w:hAnsi="Arial" w:cs="Arial"/>
-          <w:sz w:val="24"/>
-          <w:szCs w:val="24"/>
-        </w:rPr>
-        <w:t xml:space="preserve"> the global object (window in browsers; undefined in strict mode functions).</w:t>
-      </w:r>
-    </w:p>
-    <w:p>
-      <w:pPr>
-        <w:pStyle w:val="NoSpacing"/>
-        <w:ind w:left="360" w:hanging="360"/>
-        <w:jc w:val="both"/>
-        <w:rPr>
-          <w:rFonts w:ascii="Arial" w:hAnsi="Arial" w:cs="Arial"/>
-          <w:sz w:val="24"/>
-          <w:szCs w:val="24"/>
-        </w:rPr>
-      </w:pPr>
-      <w:r>
-        <w:rPr>
-          <w:rFonts w:ascii="Arial" w:hAnsi="Arial" w:cs="Arial"/>
-          <w:sz w:val="24"/>
-          <w:szCs w:val="24"/>
-        </w:rPr>
-        <w:tab/>
-      </w:r>
-      <w:r>
-        <w:rPr>
-          <w:rFonts w:ascii="Arial" w:hAnsi="Arial" w:cs="Arial"/>
-          <w:b/>
-          <w:sz w:val="24"/>
-          <w:szCs w:val="24"/>
-        </w:rPr>
-        <w:t>- Object method:</w:t>
-      </w:r>
-      <w:r>
-        <w:rPr>
-          <w:rFonts w:ascii="Arial" w:hAnsi="Arial" w:cs="Arial"/>
-          <w:sz w:val="24"/>
-          <w:szCs w:val="24"/>
-        </w:rPr>
-        <w:t xml:space="preserve"> the object before the dot (</w:t>
-      </w:r>
-      <w:proofErr w:type="spellStart"/>
-      <w:proofErr w:type="gramStart"/>
-      <w:r>
-        <w:rPr>
-          <w:rFonts w:ascii="Arial" w:hAnsi="Arial" w:cs="Arial"/>
-          <w:sz w:val="24"/>
-          <w:szCs w:val="24"/>
-        </w:rPr>
-        <w:t>obj.method</w:t>
-      </w:r>
-      <w:proofErr w:type="spellEnd"/>
-      <w:r>
-        <w:rPr>
-          <w:rFonts w:ascii="Arial" w:hAnsi="Arial" w:cs="Arial"/>
-          <w:sz w:val="24"/>
-          <w:szCs w:val="24"/>
-        </w:rPr>
-        <w:t>(</w:t>
-      </w:r>
-      <w:proofErr w:type="gramEnd"/>
-      <w:r>
-        <w:rPr>
-          <w:rFonts w:ascii="Arial" w:hAnsi="Arial" w:cs="Arial"/>
-          <w:sz w:val="24"/>
-          <w:szCs w:val="24"/>
-        </w:rPr>
-        <w:t xml:space="preserve">) gives </w:t>
-      </w:r>
-      <w:proofErr w:type="spellStart"/>
-      <w:r>
-        <w:rPr>
-          <w:rFonts w:ascii="Arial" w:hAnsi="Arial" w:cs="Arial"/>
-          <w:sz w:val="24"/>
-          <w:szCs w:val="24"/>
-        </w:rPr>
-        <w:t>obj</w:t>
-      </w:r>
-      <w:proofErr w:type="spellEnd"/>
-      <w:r>
-        <w:rPr>
-          <w:rFonts w:ascii="Arial" w:hAnsi="Arial" w:cs="Arial"/>
-          <w:sz w:val="24"/>
-          <w:szCs w:val="24"/>
-        </w:rPr>
-        <w:t>).</w:t>
-      </w:r>
-    </w:p>
-    <w:p>
-      <w:pPr>
-        <w:pStyle w:val="NoSpacing"/>
-        <w:ind w:left="360" w:hanging="360"/>
-        <w:jc w:val="both"/>
-        <w:rPr>
-          <w:rFonts w:ascii="Arial" w:hAnsi="Arial" w:cs="Arial"/>
-          <w:sz w:val="24"/>
-          <w:szCs w:val="24"/>
-        </w:rPr>
-      </w:pPr>
-      <w:r>
-        <w:rPr>
-          <w:rFonts w:ascii="Arial" w:hAnsi="Arial" w:cs="Arial"/>
-          <w:sz w:val="24"/>
-          <w:szCs w:val="24"/>
-        </w:rPr>
-        <w:tab/>
-      </w:r>
-      <w:r>
-        <w:rPr>
-          <w:rFonts w:ascii="Arial" w:hAnsi="Arial" w:cs="Arial"/>
-          <w:b/>
-          <w:sz w:val="24"/>
-          <w:szCs w:val="24"/>
-        </w:rPr>
-        <w:t>- Constructor / class (new):</w:t>
-      </w:r>
-      <w:r>
-        <w:rPr>
-          <w:rFonts w:ascii="Arial" w:hAnsi="Arial" w:cs="Arial"/>
-          <w:sz w:val="24"/>
-          <w:szCs w:val="24"/>
-        </w:rPr>
-        <w:t xml:space="preserve"> the newly created object.</w:t>
-      </w:r>
-    </w:p>
-    <w:p>
-      <w:pPr>
-        <w:pStyle w:val="NoSpacing"/>
-        <w:ind w:left="360" w:hanging="360"/>
-        <w:jc w:val="both"/>
-        <w:rPr>
-          <w:rFonts w:ascii="Arial" w:hAnsi="Arial" w:cs="Arial"/>
-          <w:sz w:val="24"/>
-          <w:szCs w:val="24"/>
-        </w:rPr>
-      </w:pPr>
-      <w:r>
-        <w:rPr>
-          <w:rFonts w:ascii="Arial" w:hAnsi="Arial" w:cs="Arial"/>
-          <w:sz w:val="24"/>
-          <w:szCs w:val="24"/>
-        </w:rPr>
-        <w:tab/>
-      </w:r>
-      <w:r>
-        <w:rPr>
-          <w:rFonts w:ascii="Arial" w:hAnsi="Arial" w:cs="Arial"/>
-          <w:b/>
-          <w:sz w:val="24"/>
-          <w:szCs w:val="24"/>
-        </w:rPr>
-        <w:t>- call / apply / bind:</w:t>
-      </w:r>
-      <w:r>
-        <w:rPr>
-          <w:rFonts w:ascii="Arial" w:hAnsi="Arial" w:cs="Arial"/>
-          <w:sz w:val="24"/>
-          <w:szCs w:val="24"/>
-        </w:rPr>
-        <w:t xml:space="preserve"> whatever object you specify.</w:t>
-      </w:r>
-    </w:p>
-    <w:p>
-      <w:pPr>
-        <w:pStyle w:val="NoSpacing"/>
-        <w:ind w:left="360" w:hanging="360"/>
-        <w:jc w:val="both"/>
-        <w:rPr>
-          <w:rFonts w:ascii="Arial" w:hAnsi="Arial" w:cs="Arial"/>
-          <w:sz w:val="24"/>
-          <w:szCs w:val="24"/>
-        </w:rPr>
-      </w:pPr>
-      <w:r>
-        <w:rPr>
-          <w:rFonts w:ascii="Arial" w:hAnsi="Arial" w:cs="Arial"/>
-          <w:sz w:val="24"/>
-          <w:szCs w:val="24"/>
-        </w:rPr>
-        <w:tab/>
-      </w:r>
-      <w:r>
-        <w:rPr>
-          <w:rFonts w:ascii="Arial" w:hAnsi="Arial" w:cs="Arial"/>
-          <w:b/>
-          <w:sz w:val="24"/>
-          <w:szCs w:val="24"/>
-        </w:rPr>
-        <w:t>- Arrow functions:</w:t>
-      </w:r>
-      <w:r>
-        <w:rPr>
-          <w:rFonts w:ascii="Arial" w:hAnsi="Arial" w:cs="Arial"/>
-          <w:sz w:val="24"/>
-          <w:szCs w:val="24"/>
-        </w:rPr>
-        <w:t xml:space="preserve"> have no own this; they inherit it from the surrounding scope.</w:t>
-      </w:r>
-    </w:p>
-    <w:p>
-      <w:pPr>
-        <w:pStyle w:val="NoSpacing"/>
-        <w:ind w:left="360" w:hanging="360"/>
-        <w:jc w:val="both"/>
-        <w:rPr>
-          <w:rFonts w:ascii="Arial" w:hAnsi="Arial" w:cs="Arial"/>
-          <w:sz w:val="24"/>
-          <w:szCs w:val="24"/>
-        </w:rPr>
-      </w:pPr>
-      <w:r>
-        <w:rPr>
-          <w:rFonts w:ascii="Arial" w:hAnsi="Arial" w:cs="Arial"/>
-          <w:sz w:val="24"/>
-          <w:szCs w:val="24"/>
-        </w:rPr>
-        <w:tab/>
-      </w:r>
-      <w:r>
-        <w:rPr>
-          <w:rFonts w:ascii="Arial" w:hAnsi="Arial" w:cs="Arial"/>
-          <w:b/>
-          <w:sz w:val="24"/>
-          <w:szCs w:val="24"/>
-        </w:rPr>
-        <w:t>- Event handler:</w:t>
-      </w:r>
-      <w:r>
-        <w:rPr>
-          <w:rFonts w:ascii="Arial" w:hAnsi="Arial" w:cs="Arial"/>
-          <w:sz w:val="24"/>
-          <w:szCs w:val="24"/>
-        </w:rPr>
-        <w:t xml:space="preserve"> the element that received the event (regular functions). </w:t>
-      </w:r>
-    </w:p>
-    <w:p>
-      <w:pPr>
-        <w:pStyle w:val="NoSpacing"/>
-        <w:ind w:left="360" w:hanging="360"/>
-        <w:jc w:val="both"/>
-        <w:rPr>
-          <w:rFonts w:ascii="Arial" w:hAnsi="Arial" w:cs="Arial"/>
-          <w:sz w:val="24"/>
-          <w:szCs w:val="24"/>
-        </w:rPr>
-      </w:pPr>
-      <w:r>
-        <w:rPr>
-          <w:rFonts w:ascii="Arial" w:hAnsi="Arial" w:cs="Arial"/>
-          <w:sz w:val="24"/>
-          <w:szCs w:val="24"/>
-        </w:rPr>
-        <w:tab/>
-      </w:r>
-    </w:p>
-    <w:p>
-      <w:pPr>
-        <w:spacing w:after="0" w:line="240" w:lineRule="auto"/>
-        <w:ind w:left="360" w:hanging="360"/>
-      </w:pPr>
-    </w:p>
-    <w:p>
-      <w:pPr>
-        <w:spacing w:after="0" w:line="240" w:lineRule="auto"/>
-        <w:ind w:left="360" w:hanging="360"/>
-      </w:pPr>
     </w:p>
     <w:sectPr>
       <w:pgSz w:w="11909" w:h="16834" w:code="9"/>

</xml_diff>

<commit_message>
React interview question added
</commit_message>
<xml_diff>
--- a/Javascript interviev question.docx
+++ b/Javascript interviev question.docx
@@ -1003,6 +1003,18 @@
       <w:pPr>
         <w:pStyle w:val="NoSpacing"/>
         <w:ind w:left="360" w:hanging="360"/>
+        <w:jc w:val="both"/>
+        <w:rPr>
+          <w:rFonts w:ascii="Arial" w:hAnsi="Arial" w:cs="Arial"/>
+          <w:sz w:val="24"/>
+          <w:szCs w:val="24"/>
+        </w:rPr>
+      </w:pPr>
+    </w:p>
+    <w:p>
+      <w:pPr>
+        <w:pStyle w:val="NoSpacing"/>
+        <w:ind w:left="360" w:hanging="360"/>
         <w:rPr>
           <w:rFonts w:ascii="Arial" w:hAnsi="Arial" w:cs="Arial"/>
           <w:b/>
@@ -1011,6 +1023,430 @@
           <w:szCs w:val="24"/>
         </w:rPr>
       </w:pPr>
+      <w:r>
+        <w:rPr>
+          <w:rFonts w:ascii="Arial" w:hAnsi="Arial" w:cs="Arial"/>
+          <w:b/>
+          <w:color w:val="E36C0A" w:themeColor="accent6" w:themeShade="BF"/>
+          <w:sz w:val="24"/>
+          <w:szCs w:val="24"/>
+        </w:rPr>
+        <w:t>11. What is an Event Loop?</w:t>
+      </w:r>
+    </w:p>
+    <w:p>
+      <w:pPr>
+        <w:pStyle w:val="NoSpacing"/>
+        <w:ind w:left="360" w:hanging="360"/>
+        <w:rPr>
+          <w:rFonts w:ascii="Arial" w:hAnsi="Arial" w:cs="Arial"/>
+          <w:sz w:val="24"/>
+          <w:szCs w:val="24"/>
+        </w:rPr>
+      </w:pPr>
+      <w:r>
+        <w:rPr>
+          <w:rFonts w:ascii="Arial" w:hAnsi="Arial" w:cs="Arial"/>
+          <w:sz w:val="24"/>
+          <w:szCs w:val="24"/>
+        </w:rPr>
+        <w:tab/>
+      </w:r>
+      <w:r>
+        <w:rPr>
+          <w:rFonts w:ascii="Arial" w:hAnsi="Arial" w:cs="Arial"/>
+          <w:sz w:val="24"/>
+          <w:szCs w:val="24"/>
+        </w:rPr>
+        <w:t xml:space="preserve">JavaScript is single-threaded, yet it handles </w:t>
+      </w:r>
+      <w:proofErr w:type="spellStart"/>
+      <w:r>
+        <w:rPr>
+          <w:rFonts w:ascii="Arial" w:hAnsi="Arial" w:cs="Arial"/>
+          <w:sz w:val="24"/>
+          <w:szCs w:val="24"/>
+        </w:rPr>
+        <w:t>async</w:t>
+      </w:r>
+      <w:proofErr w:type="spellEnd"/>
+      <w:r>
+        <w:rPr>
+          <w:rFonts w:ascii="Arial" w:hAnsi="Arial" w:cs="Arial"/>
+          <w:sz w:val="24"/>
+          <w:szCs w:val="24"/>
+        </w:rPr>
+        <w:t xml:space="preserve"> tasks thanks to the event loop. It continuously</w:t>
+      </w:r>
+      <w:r>
+        <w:rPr>
+          <w:rFonts w:ascii="Arial" w:hAnsi="Arial" w:cs="Arial"/>
+          <w:sz w:val="24"/>
+          <w:szCs w:val="24"/>
+        </w:rPr>
+        <w:t xml:space="preserve"> </w:t>
+      </w:r>
+      <w:r>
+        <w:rPr>
+          <w:rFonts w:ascii="Arial" w:hAnsi="Arial" w:cs="Arial"/>
+          <w:sz w:val="24"/>
+          <w:szCs w:val="24"/>
+        </w:rPr>
+        <w:t>checks whether the call stack is empty and, if so, moves the next queued callback onto the stack.</w:t>
+      </w:r>
+    </w:p>
+    <w:p>
+      <w:pPr>
+        <w:pStyle w:val="NoSpacing"/>
+        <w:ind w:left="360" w:hanging="360"/>
+        <w:rPr>
+          <w:rFonts w:ascii="Arial" w:hAnsi="Arial" w:cs="Arial"/>
+          <w:sz w:val="24"/>
+          <w:szCs w:val="24"/>
+        </w:rPr>
+      </w:pPr>
+      <w:r>
+        <w:rPr>
+          <w:rFonts w:ascii="Arial" w:hAnsi="Arial" w:cs="Arial"/>
+          <w:sz w:val="24"/>
+          <w:szCs w:val="24"/>
+        </w:rPr>
+        <w:tab/>
+      </w:r>
+      <w:r>
+        <w:rPr>
+          <w:rFonts w:ascii="Arial" w:hAnsi="Arial" w:cs="Arial"/>
+          <w:sz w:val="24"/>
+          <w:szCs w:val="24"/>
+        </w:rPr>
+        <w:t>- Call stack: where synchronous code runs.</w:t>
+      </w:r>
+    </w:p>
+    <w:p>
+      <w:pPr>
+        <w:pStyle w:val="NoSpacing"/>
+        <w:ind w:left="360" w:hanging="360"/>
+        <w:rPr>
+          <w:rFonts w:ascii="Arial" w:hAnsi="Arial" w:cs="Arial"/>
+          <w:sz w:val="24"/>
+          <w:szCs w:val="24"/>
+        </w:rPr>
+      </w:pPr>
+      <w:r>
+        <w:rPr>
+          <w:rFonts w:ascii="Arial" w:hAnsi="Arial" w:cs="Arial"/>
+          <w:sz w:val="24"/>
+          <w:szCs w:val="24"/>
+        </w:rPr>
+        <w:tab/>
+      </w:r>
+      <w:r>
+        <w:rPr>
+          <w:rFonts w:ascii="Arial" w:hAnsi="Arial" w:cs="Arial"/>
+          <w:sz w:val="24"/>
+          <w:szCs w:val="24"/>
+        </w:rPr>
+        <w:t>- Web APIs: timers, fetch, DOM events are handled by the browser.</w:t>
+      </w:r>
+    </w:p>
+    <w:p>
+      <w:pPr>
+        <w:pStyle w:val="NoSpacing"/>
+        <w:ind w:left="360" w:hanging="360"/>
+        <w:rPr>
+          <w:rFonts w:ascii="Arial" w:hAnsi="Arial" w:cs="Arial"/>
+          <w:sz w:val="24"/>
+          <w:szCs w:val="24"/>
+        </w:rPr>
+      </w:pPr>
+      <w:r>
+        <w:rPr>
+          <w:rFonts w:ascii="Arial" w:hAnsi="Arial" w:cs="Arial"/>
+          <w:sz w:val="24"/>
+          <w:szCs w:val="24"/>
+        </w:rPr>
+        <w:tab/>
+      </w:r>
+      <w:r>
+        <w:rPr>
+          <w:rFonts w:ascii="Arial" w:hAnsi="Arial" w:cs="Arial"/>
+          <w:sz w:val="24"/>
+          <w:szCs w:val="24"/>
+        </w:rPr>
+        <w:t xml:space="preserve">- </w:t>
+      </w:r>
+      <w:proofErr w:type="spellStart"/>
+      <w:r>
+        <w:rPr>
+          <w:rFonts w:ascii="Arial" w:hAnsi="Arial" w:cs="Arial"/>
+          <w:sz w:val="24"/>
+          <w:szCs w:val="24"/>
+        </w:rPr>
+        <w:t>Microtask</w:t>
+      </w:r>
+      <w:proofErr w:type="spellEnd"/>
+      <w:r>
+        <w:rPr>
+          <w:rFonts w:ascii="Arial" w:hAnsi="Arial" w:cs="Arial"/>
+          <w:sz w:val="24"/>
+          <w:szCs w:val="24"/>
+        </w:rPr>
+        <w:t xml:space="preserve"> queue: promise callbacks (.then, </w:t>
+      </w:r>
+      <w:proofErr w:type="spellStart"/>
+      <w:r>
+        <w:rPr>
+          <w:rFonts w:ascii="Arial" w:hAnsi="Arial" w:cs="Arial"/>
+          <w:sz w:val="24"/>
+          <w:szCs w:val="24"/>
+        </w:rPr>
+        <w:t>async</w:t>
+      </w:r>
+      <w:proofErr w:type="spellEnd"/>
+      <w:r>
+        <w:rPr>
+          <w:rFonts w:ascii="Arial" w:hAnsi="Arial" w:cs="Arial"/>
+          <w:sz w:val="24"/>
+          <w:szCs w:val="24"/>
+        </w:rPr>
+        <w:t>/</w:t>
+      </w:r>
+      <w:proofErr w:type="gramStart"/>
+      <w:r>
+        <w:rPr>
+          <w:rFonts w:ascii="Arial" w:hAnsi="Arial" w:cs="Arial"/>
+          <w:sz w:val="24"/>
+          <w:szCs w:val="24"/>
+        </w:rPr>
+        <w:t>await</w:t>
+      </w:r>
+      <w:proofErr w:type="gramEnd"/>
+      <w:r>
+        <w:rPr>
+          <w:rFonts w:ascii="Arial" w:hAnsi="Arial" w:cs="Arial"/>
+          <w:sz w:val="24"/>
+          <w:szCs w:val="24"/>
+        </w:rPr>
+        <w:t xml:space="preserve">), </w:t>
+      </w:r>
+      <w:proofErr w:type="spellStart"/>
+      <w:r>
+        <w:rPr>
+          <w:rFonts w:ascii="Arial" w:hAnsi="Arial" w:cs="Arial"/>
+          <w:sz w:val="24"/>
+          <w:szCs w:val="24"/>
+        </w:rPr>
+        <w:t>queueMicrotask</w:t>
+      </w:r>
+      <w:proofErr w:type="spellEnd"/>
+      <w:r>
+        <w:rPr>
+          <w:rFonts w:ascii="Arial" w:hAnsi="Arial" w:cs="Arial"/>
+          <w:sz w:val="24"/>
+          <w:szCs w:val="24"/>
+        </w:rPr>
+        <w:t xml:space="preserve">. </w:t>
+      </w:r>
+      <w:proofErr w:type="gramStart"/>
+      <w:r>
+        <w:rPr>
+          <w:rFonts w:ascii="Arial" w:hAnsi="Arial" w:cs="Arial"/>
+          <w:sz w:val="24"/>
+          <w:szCs w:val="24"/>
+        </w:rPr>
+        <w:t>Higher priority.</w:t>
+      </w:r>
+      <w:proofErr w:type="gramEnd"/>
+    </w:p>
+    <w:p>
+      <w:pPr>
+        <w:pStyle w:val="NoSpacing"/>
+        <w:ind w:left="360" w:hanging="360"/>
+        <w:rPr>
+          <w:rFonts w:ascii="Arial" w:hAnsi="Arial" w:cs="Arial"/>
+          <w:sz w:val="24"/>
+          <w:szCs w:val="24"/>
+        </w:rPr>
+      </w:pPr>
+      <w:r>
+        <w:rPr>
+          <w:rFonts w:ascii="Arial" w:hAnsi="Arial" w:cs="Arial"/>
+          <w:sz w:val="24"/>
+          <w:szCs w:val="24"/>
+        </w:rPr>
+        <w:tab/>
+      </w:r>
+      <w:r>
+        <w:rPr>
+          <w:rFonts w:ascii="Arial" w:hAnsi="Arial" w:cs="Arial"/>
+          <w:sz w:val="24"/>
+          <w:szCs w:val="24"/>
+        </w:rPr>
+        <w:t xml:space="preserve">- </w:t>
+      </w:r>
+      <w:proofErr w:type="spellStart"/>
+      <w:r>
+        <w:rPr>
+          <w:rFonts w:ascii="Arial" w:hAnsi="Arial" w:cs="Arial"/>
+          <w:sz w:val="24"/>
+          <w:szCs w:val="24"/>
+        </w:rPr>
+        <w:t>Macrotask</w:t>
+      </w:r>
+      <w:proofErr w:type="spellEnd"/>
+      <w:r>
+        <w:rPr>
+          <w:rFonts w:ascii="Arial" w:hAnsi="Arial" w:cs="Arial"/>
+          <w:sz w:val="24"/>
+          <w:szCs w:val="24"/>
+        </w:rPr>
+        <w:t xml:space="preserve"> (task) queue: </w:t>
+      </w:r>
+      <w:proofErr w:type="spellStart"/>
+      <w:r>
+        <w:rPr>
+          <w:rFonts w:ascii="Arial" w:hAnsi="Arial" w:cs="Arial"/>
+          <w:sz w:val="24"/>
+          <w:szCs w:val="24"/>
+        </w:rPr>
+        <w:t>setTimeout</w:t>
+      </w:r>
+      <w:proofErr w:type="spellEnd"/>
+      <w:r>
+        <w:rPr>
+          <w:rFonts w:ascii="Arial" w:hAnsi="Arial" w:cs="Arial"/>
+          <w:sz w:val="24"/>
+          <w:szCs w:val="24"/>
+        </w:rPr>
+        <w:t xml:space="preserve">, </w:t>
+      </w:r>
+      <w:proofErr w:type="spellStart"/>
+      <w:r>
+        <w:rPr>
+          <w:rFonts w:ascii="Arial" w:hAnsi="Arial" w:cs="Arial"/>
+          <w:sz w:val="24"/>
+          <w:szCs w:val="24"/>
+        </w:rPr>
+        <w:t>setInterval</w:t>
+      </w:r>
+      <w:proofErr w:type="spellEnd"/>
+      <w:r>
+        <w:rPr>
+          <w:rFonts w:ascii="Arial" w:hAnsi="Arial" w:cs="Arial"/>
+          <w:sz w:val="24"/>
+          <w:szCs w:val="24"/>
+        </w:rPr>
+        <w:t>, I/O, UI events.</w:t>
+      </w:r>
+    </w:p>
+    <w:p>
+      <w:pPr>
+        <w:pStyle w:val="NoSpacing"/>
+        <w:ind w:left="360" w:hanging="360"/>
+        <w:rPr>
+          <w:rFonts w:ascii="Arial" w:hAnsi="Arial" w:cs="Arial"/>
+          <w:color w:val="E36C0A" w:themeColor="accent6" w:themeShade="BF"/>
+          <w:sz w:val="24"/>
+          <w:szCs w:val="24"/>
+        </w:rPr>
+      </w:pPr>
+      <w:r>
+        <w:rPr>
+          <w:rFonts w:ascii="Arial" w:hAnsi="Arial" w:cs="Arial"/>
+          <w:sz w:val="24"/>
+          <w:szCs w:val="24"/>
+        </w:rPr>
+        <w:tab/>
+      </w:r>
+      <w:r>
+        <w:rPr>
+          <w:rFonts w:ascii="Arial" w:hAnsi="Arial" w:cs="Arial"/>
+          <w:sz w:val="24"/>
+          <w:szCs w:val="24"/>
+        </w:rPr>
+        <w:t xml:space="preserve">- Order: </w:t>
+      </w:r>
+      <w:proofErr w:type="gramStart"/>
+      <w:r>
+        <w:rPr>
+          <w:rFonts w:ascii="Arial" w:hAnsi="Arial" w:cs="Arial"/>
+          <w:sz w:val="24"/>
+          <w:szCs w:val="24"/>
+        </w:rPr>
+        <w:t xml:space="preserve">run stack, then all </w:t>
+      </w:r>
+      <w:proofErr w:type="spellStart"/>
+      <w:r>
+        <w:rPr>
+          <w:rFonts w:ascii="Arial" w:hAnsi="Arial" w:cs="Arial"/>
+          <w:sz w:val="24"/>
+          <w:szCs w:val="24"/>
+        </w:rPr>
+        <w:t>microtasks</w:t>
+      </w:r>
+      <w:proofErr w:type="spellEnd"/>
+      <w:r>
+        <w:rPr>
+          <w:rFonts w:ascii="Arial" w:hAnsi="Arial" w:cs="Arial"/>
+          <w:sz w:val="24"/>
+          <w:szCs w:val="24"/>
+        </w:rPr>
+        <w:t xml:space="preserve">, then one </w:t>
+      </w:r>
+      <w:proofErr w:type="spellStart"/>
+      <w:r>
+        <w:rPr>
+          <w:rFonts w:ascii="Arial" w:hAnsi="Arial" w:cs="Arial"/>
+          <w:sz w:val="24"/>
+          <w:szCs w:val="24"/>
+        </w:rPr>
+        <w:t>macrotask</w:t>
+      </w:r>
+      <w:proofErr w:type="spellEnd"/>
+      <w:r>
+        <w:rPr>
+          <w:rFonts w:ascii="Arial" w:hAnsi="Arial" w:cs="Arial"/>
+          <w:sz w:val="24"/>
+          <w:szCs w:val="24"/>
+        </w:rPr>
+        <w:t>, repeat</w:t>
+      </w:r>
+      <w:proofErr w:type="gramEnd"/>
+      <w:r>
+        <w:rPr>
+          <w:rFonts w:ascii="Arial" w:hAnsi="Arial" w:cs="Arial"/>
+          <w:color w:val="E36C0A" w:themeColor="accent6" w:themeShade="BF"/>
+          <w:sz w:val="24"/>
+          <w:szCs w:val="24"/>
+        </w:rPr>
+        <w:t>.</w:t>
+      </w:r>
+    </w:p>
+    <w:p>
+      <w:pPr>
+        <w:pStyle w:val="NoSpacing"/>
+        <w:ind w:left="360" w:hanging="360"/>
+        <w:rPr>
+          <w:rFonts w:ascii="Arial" w:hAnsi="Arial" w:cs="Arial"/>
+          <w:color w:val="E36C0A" w:themeColor="accent6" w:themeShade="BF"/>
+          <w:sz w:val="24"/>
+          <w:szCs w:val="24"/>
+        </w:rPr>
+      </w:pPr>
+    </w:p>
+    <w:p>
+      <w:pPr>
+        <w:pStyle w:val="NoSpacing"/>
+        <w:ind w:left="360" w:hanging="360"/>
+        <w:rPr>
+          <w:rFonts w:ascii="Arial" w:hAnsi="Arial" w:cs="Arial"/>
+          <w:color w:val="E36C0A" w:themeColor="accent6" w:themeShade="BF"/>
+          <w:sz w:val="24"/>
+          <w:szCs w:val="24"/>
+        </w:rPr>
+      </w:pPr>
+      <w:bookmarkStart w:id="0" w:name="_GoBack"/>
+      <w:bookmarkEnd w:id="0"/>
     </w:p>
     <w:p>
       <w:pPr>
@@ -1496,8 +1932,6 @@
           <w:szCs w:val="24"/>
         </w:rPr>
       </w:pPr>
-      <w:bookmarkStart w:id="0" w:name="_GoBack"/>
-      <w:bookmarkEnd w:id="0"/>
     </w:p>
     <w:sectPr>
       <w:pgSz w:w="11909" w:h="16834" w:code="9"/>

</xml_diff>